<commit_message>
Daily dashboard update — 2026-07-02
</commit_message>
<xml_diff>
--- a/reports/projects/1.1_Report.docx
+++ b/reports/projects/1.1_Report.docx
@@ -13,12 +13,12 @@
       </w:pPr>
       <w:r>
         <w:rPr>
-          <w:rFonts w:ascii="Cambria" w:cs="Cambria" w:eastAsia="Cambria" w:hAnsi="Cambria"/>
           <w:b/>
           <w:bCs/>
           <w:color w:val="0A2240"/>
           <w:sz w:val="32"/>
           <w:szCs w:val="32"/>
+          <w:rFonts w:ascii="Cambria" w:cs="Cambria" w:eastAsia="Cambria" w:hAnsi="Cambria"/>
         </w:rPr>
         <w:t xml:space="preserve">1.1  MAP Platform Development</w:t>
       </w:r>
@@ -30,12 +30,12 @@
       </w:pPr>
       <w:r>
         <w:rPr>
-          <w:rFonts w:ascii="Cambria" w:cs="Cambria" w:eastAsia="Cambria" w:hAnsi="Cambria"/>
           <w:b/>
           <w:bCs/>
           <w:color w:val="2A7D4F"/>
           <w:sz w:val="24"/>
           <w:szCs w:val="24"/>
+          <w:rFonts w:ascii="Cambria" w:cs="Cambria" w:eastAsia="Cambria" w:hAnsi="Cambria"/>
         </w:rPr>
         <w:t xml:space="preserve">✔ On Track</w:t>
       </w:r>
@@ -50,21 +50,21 @@
       </w:pPr>
       <w:r>
         <w:rPr>
-          <w:rFonts w:ascii="Cambria" w:cs="Cambria" w:eastAsia="Cambria" w:hAnsi="Cambria"/>
           <w:color w:val="666666"/>
           <w:sz w:val="19"/>
           <w:szCs w:val="19"/>
+          <w:rFonts w:ascii="Cambria" w:cs="Cambria" w:eastAsia="Cambria" w:hAnsi="Cambria"/>
         </w:rPr>
         <w:t xml:space="preserve">Activity 1: AI-Enhanced CPL Infrastructure  |  Goal 2; Goal 3  |  </w:t>
       </w:r>
       <w:r>
         <w:rPr>
-          <w:rFonts w:ascii="Cambria" w:cs="Cambria" w:eastAsia="Cambria" w:hAnsi="Cambria"/>
           <w:color w:val="666666"/>
           <w:sz w:val="19"/>
           <w:szCs w:val="19"/>
+          <w:rFonts w:ascii="Cambria" w:cs="Cambria" w:eastAsia="Cambria" w:hAnsi="Cambria"/>
         </w:rPr>
-        <w:t xml:space="preserve">April 14, 2026</w:t>
+        <w:t xml:space="preserve">July 2, 2026</w:t>
       </w:r>
     </w:p>
     <w:tbl>
@@ -107,12 +107,12 @@
             </w:pPr>
             <w:r>
               <w:rPr>
-                <w:rFonts w:ascii="Cambria" w:cs="Cambria" w:eastAsia="Cambria" w:hAnsi="Cambria"/>
                 <w:b/>
                 <w:bCs/>
                 <w:color w:val="163A5F"/>
                 <w:sz w:val="20"/>
                 <w:szCs w:val="20"/>
+                <w:rFonts w:ascii="Cambria" w:cs="Cambria" w:eastAsia="Cambria" w:hAnsi="Cambria"/>
               </w:rPr>
               <w:t xml:space="preserve">Status</w:t>
             </w:r>
@@ -141,12 +141,12 @@
             </w:pPr>
             <w:r>
               <w:rPr>
-                <w:rFonts w:ascii="Cambria" w:cs="Cambria" w:eastAsia="Cambria" w:hAnsi="Cambria"/>
                 <w:b/>
                 <w:bCs/>
                 <w:color w:val="2A7D4F"/>
                 <w:sz w:val="20"/>
                 <w:szCs w:val="20"/>
+                <w:rFonts w:ascii="Cambria" w:cs="Cambria" w:eastAsia="Cambria" w:hAnsi="Cambria"/>
               </w:rPr>
               <w:t xml:space="preserve">On Track</w:t>
             </w:r>
@@ -177,12 +177,12 @@
             </w:pPr>
             <w:r>
               <w:rPr>
-                <w:rFonts w:ascii="Cambria" w:cs="Cambria" w:eastAsia="Cambria" w:hAnsi="Cambria"/>
                 <w:b/>
                 <w:bCs/>
                 <w:color w:val="163A5F"/>
                 <w:sz w:val="20"/>
                 <w:szCs w:val="20"/>
+                <w:rFonts w:ascii="Cambria" w:cs="Cambria" w:eastAsia="Cambria" w:hAnsi="Cambria"/>
               </w:rPr>
               <w:t xml:space="preserve">Progress</w:t>
             </w:r>
@@ -211,12 +211,12 @@
             </w:pPr>
             <w:r>
               <w:rPr>
-                <w:rFonts w:ascii="Cambria" w:cs="Cambria" w:eastAsia="Cambria" w:hAnsi="Cambria"/>
                 <w:b/>
                 <w:bCs/>
                 <w:color w:val="2A7D4F"/>
                 <w:sz w:val="20"/>
                 <w:szCs w:val="20"/>
+                <w:rFonts w:ascii="Cambria" w:cs="Cambria" w:eastAsia="Cambria" w:hAnsi="Cambria"/>
               </w:rPr>
               <w:t xml:space="preserve">70%</w:t>
             </w:r>
@@ -247,12 +247,12 @@
             </w:pPr>
             <w:r>
               <w:rPr>
-                <w:rFonts w:ascii="Cambria" w:cs="Cambria" w:eastAsia="Cambria" w:hAnsi="Cambria"/>
                 <w:b/>
                 <w:bCs/>
                 <w:color w:val="163A5F"/>
                 <w:sz w:val="20"/>
                 <w:szCs w:val="20"/>
+                <w:rFonts w:ascii="Cambria" w:cs="Cambria" w:eastAsia="Cambria" w:hAnsi="Cambria"/>
               </w:rPr>
               <w:t xml:space="preserve">Lead</w:t>
             </w:r>
@@ -281,12 +281,12 @@
             </w:pPr>
             <w:r>
               <w:rPr>
-                <w:rFonts w:ascii="Cambria" w:cs="Cambria" w:eastAsia="Cambria" w:hAnsi="Cambria"/>
                 <w:b w:val="false"/>
                 <w:bCs w:val="false"/>
                 <w:color w:val="333333"/>
                 <w:sz w:val="20"/>
                 <w:szCs w:val="20"/>
+                <w:rFonts w:ascii="Cambria" w:cs="Cambria" w:eastAsia="Cambria" w:hAnsi="Cambria"/>
               </w:rPr>
               <w:t xml:space="preserve">Terence Nelson</w:t>
             </w:r>
@@ -317,12 +317,12 @@
             </w:pPr>
             <w:r>
               <w:rPr>
-                <w:rFonts w:ascii="Cambria" w:cs="Cambria" w:eastAsia="Cambria" w:hAnsi="Cambria"/>
                 <w:b/>
                 <w:bCs/>
                 <w:color w:val="163A5F"/>
                 <w:sz w:val="20"/>
                 <w:szCs w:val="20"/>
+                <w:rFonts w:ascii="Cambria" w:cs="Cambria" w:eastAsia="Cambria" w:hAnsi="Cambria"/>
               </w:rPr>
               <w:t xml:space="preserve">Budget</w:t>
             </w:r>
@@ -351,12 +351,12 @@
             </w:pPr>
             <w:r>
               <w:rPr>
-                <w:rFonts w:ascii="Cambria" w:cs="Cambria" w:eastAsia="Cambria" w:hAnsi="Cambria"/>
                 <w:b w:val="false"/>
                 <w:bCs w:val="false"/>
                 <w:color w:val="333333"/>
                 <w:sz w:val="20"/>
                 <w:szCs w:val="20"/>
+                <w:rFonts w:ascii="Cambria" w:cs="Cambria" w:eastAsia="Cambria" w:hAnsi="Cambria"/>
               </w:rPr>
               <w:t xml:space="preserve">$2,400,000 (MAP Team Operations (GFA0164))</w:t>
             </w:r>
@@ -387,12 +387,12 @@
             </w:pPr>
             <w:r>
               <w:rPr>
-                <w:rFonts w:ascii="Cambria" w:cs="Cambria" w:eastAsia="Cambria" w:hAnsi="Cambria"/>
                 <w:b/>
                 <w:bCs/>
                 <w:color w:val="163A5F"/>
                 <w:sz w:val="20"/>
                 <w:szCs w:val="20"/>
+                <w:rFonts w:ascii="Cambria" w:cs="Cambria" w:eastAsia="Cambria" w:hAnsi="Cambria"/>
               </w:rPr>
               <w:t xml:space="preserve">KPI Current</w:t>
             </w:r>
@@ -421,12 +421,12 @@
             </w:pPr>
             <w:r>
               <w:rPr>
-                <w:rFonts w:ascii="Cambria" w:cs="Cambria" w:eastAsia="Cambria" w:hAnsi="Cambria"/>
                 <w:b w:val="false"/>
                 <w:bCs w:val="false"/>
                 <w:color w:val="0A2240"/>
                 <w:sz w:val="20"/>
                 <w:szCs w:val="20"/>
+                <w:rFonts w:ascii="Cambria" w:cs="Cambria" w:eastAsia="Cambria" w:hAnsi="Cambria"/>
               </w:rPr>
               <w:t xml:space="preserve">8 Cumulative MAP features added and significantly enhanced</w:t>
             </w:r>
@@ -457,12 +457,12 @@
             </w:pPr>
             <w:r>
               <w:rPr>
-                <w:rFonts w:ascii="Cambria" w:cs="Cambria" w:eastAsia="Cambria" w:hAnsi="Cambria"/>
                 <w:b/>
                 <w:bCs/>
                 <w:color w:val="163A5F"/>
                 <w:sz w:val="20"/>
                 <w:szCs w:val="20"/>
+                <w:rFonts w:ascii="Cambria" w:cs="Cambria" w:eastAsia="Cambria" w:hAnsi="Cambria"/>
               </w:rPr>
               <w:t xml:space="preserve">2030 Goal</w:t>
             </w:r>
@@ -491,12 +491,12 @@
             </w:pPr>
             <w:r>
               <w:rPr>
-                <w:rFonts w:ascii="Cambria" w:cs="Cambria" w:eastAsia="Cambria" w:hAnsi="Cambria"/>
                 <w:b w:val="false"/>
                 <w:bCs w:val="false"/>
                 <w:color w:val="0A2240"/>
                 <w:sz w:val="20"/>
                 <w:szCs w:val="20"/>
+                <w:rFonts w:ascii="Cambria" w:cs="Cambria" w:eastAsia="Cambria" w:hAnsi="Cambria"/>
               </w:rPr>
               <w:t xml:space="preserve">25</w:t>
             </w:r>
@@ -527,12 +527,12 @@
             </w:pPr>
             <w:r>
               <w:rPr>
-                <w:rFonts w:ascii="Cambria" w:cs="Cambria" w:eastAsia="Cambria" w:hAnsi="Cambria"/>
                 <w:b/>
                 <w:bCs/>
                 <w:color w:val="163A5F"/>
                 <w:sz w:val="20"/>
                 <w:szCs w:val="20"/>
+                <w:rFonts w:ascii="Cambria" w:cs="Cambria" w:eastAsia="Cambria" w:hAnsi="Cambria"/>
               </w:rPr>
               <w:t xml:space="preserve">2030 Stretch</w:t>
             </w:r>
@@ -561,12 +561,12 @@
             </w:pPr>
             <w:r>
               <w:rPr>
-                <w:rFonts w:ascii="Cambria" w:cs="Cambria" w:eastAsia="Cambria" w:hAnsi="Cambria"/>
                 <w:b w:val="false"/>
                 <w:bCs w:val="false"/>
                 <w:color w:val="C9A84C"/>
                 <w:sz w:val="20"/>
                 <w:szCs w:val="20"/>
+                <w:rFonts w:ascii="Cambria" w:cs="Cambria" w:eastAsia="Cambria" w:hAnsi="Cambria"/>
               </w:rPr>
               <w:t xml:space="preserve">36</w:t>
             </w:r>
@@ -597,12 +597,12 @@
             </w:pPr>
             <w:r>
               <w:rPr>
-                <w:rFonts w:ascii="Cambria" w:cs="Cambria" w:eastAsia="Cambria" w:hAnsi="Cambria"/>
                 <w:b/>
                 <w:bCs/>
                 <w:color w:val="163A5F"/>
                 <w:sz w:val="20"/>
                 <w:szCs w:val="20"/>
+                <w:rFonts w:ascii="Cambria" w:cs="Cambria" w:eastAsia="Cambria" w:hAnsi="Cambria"/>
               </w:rPr>
               <w:t xml:space="preserve">25-26</w:t>
             </w:r>
@@ -631,12 +631,12 @@
             </w:pPr>
             <w:r>
               <w:rPr>
-                <w:rFonts w:ascii="Cambria" w:cs="Cambria" w:eastAsia="Cambria" w:hAnsi="Cambria"/>
                 <w:b w:val="false"/>
                 <w:bCs w:val="false"/>
                 <w:color w:val="333333"/>
                 <w:sz w:val="20"/>
                 <w:szCs w:val="20"/>
+                <w:rFonts w:ascii="Cambria" w:cs="Cambria" w:eastAsia="Cambria" w:hAnsi="Cambria"/>
               </w:rPr>
               <w:t xml:space="preserve">8/4</w:t>
             </w:r>
@@ -667,12 +667,12 @@
             </w:pPr>
             <w:r>
               <w:rPr>
-                <w:rFonts w:ascii="Cambria" w:cs="Cambria" w:eastAsia="Cambria" w:hAnsi="Cambria"/>
                 <w:b/>
                 <w:bCs/>
                 <w:color w:val="163A5F"/>
                 <w:sz w:val="20"/>
                 <w:szCs w:val="20"/>
+                <w:rFonts w:ascii="Cambria" w:cs="Cambria" w:eastAsia="Cambria" w:hAnsi="Cambria"/>
               </w:rPr>
               <w:t xml:space="preserve">26-27</w:t>
             </w:r>
@@ -701,12 +701,12 @@
             </w:pPr>
             <w:r>
               <w:rPr>
-                <w:rFonts w:ascii="Cambria" w:cs="Cambria" w:eastAsia="Cambria" w:hAnsi="Cambria"/>
                 <w:b w:val="false"/>
                 <w:bCs w:val="false"/>
                 <w:color w:val="333333"/>
                 <w:sz w:val="20"/>
                 <w:szCs w:val="20"/>
+                <w:rFonts w:ascii="Cambria" w:cs="Cambria" w:eastAsia="Cambria" w:hAnsi="Cambria"/>
               </w:rPr>
               <w:t xml:space="preserve">8/9</w:t>
             </w:r>
@@ -737,12 +737,12 @@
             </w:pPr>
             <w:r>
               <w:rPr>
-                <w:rFonts w:ascii="Cambria" w:cs="Cambria" w:eastAsia="Cambria" w:hAnsi="Cambria"/>
                 <w:b/>
                 <w:bCs/>
                 <w:color w:val="163A5F"/>
                 <w:sz w:val="20"/>
                 <w:szCs w:val="20"/>
+                <w:rFonts w:ascii="Cambria" w:cs="Cambria" w:eastAsia="Cambria" w:hAnsi="Cambria"/>
               </w:rPr>
               <w:t xml:space="preserve">27-28</w:t>
             </w:r>
@@ -771,12 +771,12 @@
             </w:pPr>
             <w:r>
               <w:rPr>
-                <w:rFonts w:ascii="Cambria" w:cs="Cambria" w:eastAsia="Cambria" w:hAnsi="Cambria"/>
                 <w:b w:val="false"/>
                 <w:bCs w:val="false"/>
                 <w:color w:val="333333"/>
                 <w:sz w:val="20"/>
                 <w:szCs w:val="20"/>
+                <w:rFonts w:ascii="Cambria" w:cs="Cambria" w:eastAsia="Cambria" w:hAnsi="Cambria"/>
               </w:rPr>
               <w:t xml:space="preserve">8/18</w:t>
             </w:r>
@@ -807,12 +807,12 @@
             </w:pPr>
             <w:r>
               <w:rPr>
-                <w:rFonts w:ascii="Cambria" w:cs="Cambria" w:eastAsia="Cambria" w:hAnsi="Cambria"/>
                 <w:b/>
                 <w:bCs/>
                 <w:color w:val="163A5F"/>
                 <w:sz w:val="20"/>
                 <w:szCs w:val="20"/>
+                <w:rFonts w:ascii="Cambria" w:cs="Cambria" w:eastAsia="Cambria" w:hAnsi="Cambria"/>
               </w:rPr>
               <w:t xml:space="preserve">28-29</w:t>
             </w:r>
@@ -841,12 +841,12 @@
             </w:pPr>
             <w:r>
               <w:rPr>
-                <w:rFonts w:ascii="Cambria" w:cs="Cambria" w:eastAsia="Cambria" w:hAnsi="Cambria"/>
                 <w:b w:val="false"/>
                 <w:bCs w:val="false"/>
                 <w:color w:val="333333"/>
                 <w:sz w:val="20"/>
                 <w:szCs w:val="20"/>
+                <w:rFonts w:ascii="Cambria" w:cs="Cambria" w:eastAsia="Cambria" w:hAnsi="Cambria"/>
               </w:rPr>
               <w:t xml:space="preserve">8/22</w:t>
             </w:r>
@@ -877,12 +877,12 @@
             </w:pPr>
             <w:r>
               <w:rPr>
-                <w:rFonts w:ascii="Cambria" w:cs="Cambria" w:eastAsia="Cambria" w:hAnsi="Cambria"/>
                 <w:b/>
                 <w:bCs/>
                 <w:color w:val="163A5F"/>
                 <w:sz w:val="20"/>
                 <w:szCs w:val="20"/>
+                <w:rFonts w:ascii="Cambria" w:cs="Cambria" w:eastAsia="Cambria" w:hAnsi="Cambria"/>
               </w:rPr>
               <w:t xml:space="preserve">29-30</w:t>
             </w:r>
@@ -911,12 +911,12 @@
             </w:pPr>
             <w:r>
               <w:rPr>
-                <w:rFonts w:ascii="Cambria" w:cs="Cambria" w:eastAsia="Cambria" w:hAnsi="Cambria"/>
                 <w:b w:val="false"/>
                 <w:bCs w:val="false"/>
                 <w:color w:val="333333"/>
                 <w:sz w:val="20"/>
                 <w:szCs w:val="20"/>
+                <w:rFonts w:ascii="Cambria" w:cs="Cambria" w:eastAsia="Cambria" w:hAnsi="Cambria"/>
               </w:rPr>
               <w:t xml:space="preserve">8/25</w:t>
             </w:r>
@@ -938,10 +938,10 @@
       </w:pPr>
       <w:r>
         <w:rPr>
-          <w:rFonts w:ascii="Cambria" w:cs="Cambria" w:eastAsia="Cambria" w:hAnsi="Cambria"/>
           <w:color w:val="444444"/>
           <w:sz w:val="21"/>
           <w:szCs w:val="21"/>
+          <w:rFonts w:ascii="Cambria" w:cs="Cambria" w:eastAsia="Cambria" w:hAnsi="Cambria"/>
         </w:rPr>
         <w:t xml:space="preserve">Add and refine MAP features to support student-centered CPL, enhance user experience, security, and functionality to create and maintain a one-stop CPL infrastructure for the system.</w:t>
       </w:r>
@@ -960,12 +960,12 @@
       </w:pPr>
       <w:r>
         <w:rPr>
-          <w:rFonts w:ascii="Cambria" w:cs="Cambria" w:eastAsia="Cambria" w:hAnsi="Cambria"/>
           <w:color w:val="666666"/>
           <w:sz w:val="18"/>
           <w:szCs w:val="18"/>
+          <w:rFonts w:ascii="Cambria" w:cs="Cambria" w:eastAsia="Cambria" w:hAnsi="Cambria"/>
         </w:rPr>
-        <w:t xml:space="preserve">Date: 2026-04-08</w:t>
+        <w:t xml:space="preserve">Date: 2026-06-29</w:t>
       </w:r>
     </w:p>
     <w:p>
@@ -974,12 +974,13 @@
       </w:pPr>
       <w:r>
         <w:rPr>
-          <w:rFonts w:ascii="Cambria" w:cs="Cambria" w:eastAsia="Cambria" w:hAnsi="Cambria"/>
           <w:color w:val="444444"/>
           <w:sz w:val="21"/>
           <w:szCs w:val="21"/>
+          <w:rFonts w:ascii="Cambria" w:cs="Cambria" w:eastAsia="Cambria" w:hAnsi="Cambria"/>
         </w:rPr>
-        <w:t xml:space="preserve">50+ dev tickets completed; 8 feature areas advanced; Student Portal in final dev sprint; accessibility standards implemented </w:t>
+        <w:t xml:space="preserve">Continued MAP development across Student Portal, JST processing, credential/evidence matching, dashboards, notifications, articulation workflows, landing pages, and accessibility/security. Major progress included Student Portal intake/review improvements, JST parsing and matching logic, CPL dashboard and landing page accessibility fixes, Quick Adopt/MCCR improvements, email notification fixes, exhibit/articulation workflow refinements, and 2FA/password reset work.
+DevOps export shows 500+ items created during the period, with 300+ verified and additional items advanced through UAT, release, or prod testing. Overall, the “50+ tickets completed” statement is accurate and likely conservative.</w:t>
       </w:r>
     </w:p>
     <w:p>
@@ -996,10 +997,10 @@
       </w:pPr>
       <w:r>
         <w:rPr>
-          <w:rFonts w:ascii="Cambria" w:cs="Cambria" w:eastAsia="Cambria" w:hAnsi="Cambria"/>
           <w:color w:val="444444"/>
           <w:sz w:val="21"/>
           <w:szCs w:val="21"/>
+          <w:rFonts w:ascii="Cambria" w:cs="Cambria" w:eastAsia="Cambria" w:hAnsi="Cambria"/>
         </w:rPr>
         <w:t xml:space="preserve">Progress made across eight feature areas with 50+ development tickets completed. Key enhancements include Student Portal, AI-assisted JST parsing, credential matching, and dashboard improvements.</w:t>
       </w:r>
@@ -1018,10 +1019,10 @@
       </w:pPr>
       <w:r>
         <w:rPr>
-          <w:rFonts w:ascii="Cambria" w:cs="Cambria" w:eastAsia="Cambria" w:hAnsi="Cambria"/>
           <w:color w:val="444444"/>
           <w:sz w:val="21"/>
           <w:szCs w:val="21"/>
+          <w:rFonts w:ascii="Cambria" w:cs="Cambria" w:eastAsia="Cambria" w:hAnsi="Cambria"/>
         </w:rPr>
         <w:t xml:space="preserve">April 2026: MAP Exhibit module launch; May 2026: Student CPL Portal production release</w:t>
       </w:r>
@@ -1040,10 +1041,10 @@
       </w:pPr>
       <w:r>
         <w:rPr>
-          <w:rFonts w:ascii="Cambria" w:cs="Cambria" w:eastAsia="Cambria" w:hAnsi="Cambria"/>
           <w:color w:val="666666"/>
           <w:sz w:val="18"/>
           <w:szCs w:val="18"/>
+          <w:rFonts w:ascii="Cambria" w:cs="Cambria" w:eastAsia="Cambria" w:hAnsi="Cambria"/>
         </w:rPr>
         <w:t xml:space="preserve">5 logged updates — newest first</w:t>
       </w:r>
@@ -1089,12 +1090,12 @@
             </w:pPr>
             <w:r>
               <w:rPr>
-                <w:rFonts w:ascii="Cambria" w:cs="Cambria" w:eastAsia="Cambria" w:hAnsi="Cambria"/>
                 <w:b/>
                 <w:bCs/>
                 <w:color w:val="FFFFFF"/>
                 <w:sz w:val="18"/>
                 <w:szCs w:val="18"/>
+                <w:rFonts w:ascii="Cambria" w:cs="Cambria" w:eastAsia="Cambria" w:hAnsi="Cambria"/>
               </w:rPr>
               <w:t xml:space="preserve">Date</w:t>
             </w:r>
@@ -1123,12 +1124,12 @@
             </w:pPr>
             <w:r>
               <w:rPr>
-                <w:rFonts w:ascii="Cambria" w:cs="Cambria" w:eastAsia="Cambria" w:hAnsi="Cambria"/>
                 <w:b/>
                 <w:bCs/>
                 <w:color w:val="FFFFFF"/>
                 <w:sz w:val="18"/>
                 <w:szCs w:val="18"/>
+                <w:rFonts w:ascii="Cambria" w:cs="Cambria" w:eastAsia="Cambria" w:hAnsi="Cambria"/>
               </w:rPr>
               <w:t xml:space="preserve">Type</w:t>
             </w:r>
@@ -1157,12 +1158,12 @@
             </w:pPr>
             <w:r>
               <w:rPr>
-                <w:rFonts w:ascii="Cambria" w:cs="Cambria" w:eastAsia="Cambria" w:hAnsi="Cambria"/>
                 <w:b/>
                 <w:bCs/>
                 <w:color w:val="FFFFFF"/>
                 <w:sz w:val="18"/>
                 <w:szCs w:val="18"/>
+                <w:rFonts w:ascii="Cambria" w:cs="Cambria" w:eastAsia="Cambria" w:hAnsi="Cambria"/>
               </w:rPr>
               <w:t xml:space="preserve">Note</w:t>
             </w:r>
@@ -1193,12 +1194,12 @@
             </w:pPr>
             <w:r>
               <w:rPr>
-                <w:rFonts w:ascii="Cambria" w:cs="Cambria" w:eastAsia="Cambria" w:hAnsi="Cambria"/>
                 <w:b w:val="false"/>
                 <w:bCs w:val="false"/>
                 <w:color w:val="666666"/>
                 <w:sz w:val="18"/>
                 <w:szCs w:val="18"/>
+                <w:rFonts w:ascii="Cambria" w:cs="Cambria" w:eastAsia="Cambria" w:hAnsi="Cambria"/>
               </w:rPr>
               <w:t xml:space="preserve">2026-04-08</w:t>
             </w:r>
@@ -1227,12 +1228,12 @@
             </w:pPr>
             <w:r>
               <w:rPr>
-                <w:rFonts w:ascii="Cambria" w:cs="Cambria" w:eastAsia="Cambria" w:hAnsi="Cambria"/>
                 <w:b/>
                 <w:bCs/>
                 <w:color w:val="163A5F"/>
                 <w:sz w:val="17"/>
                 <w:szCs w:val="17"/>
+                <w:rFonts w:ascii="Cambria" w:cs="Cambria" w:eastAsia="Cambria" w:hAnsi="Cambria"/>
               </w:rPr>
               <w:t xml:space="preserve">Progress Update</w:t>
             </w:r>
@@ -1261,12 +1262,12 @@
             </w:pPr>
             <w:r>
               <w:rPr>
-                <w:rFonts w:ascii="Cambria" w:cs="Cambria" w:eastAsia="Cambria" w:hAnsi="Cambria"/>
                 <w:b w:val="false"/>
                 <w:bCs w:val="false"/>
                 <w:color w:val="333333"/>
                 <w:sz w:val="18"/>
                 <w:szCs w:val="18"/>
+                <w:rFonts w:ascii="Cambria" w:cs="Cambria" w:eastAsia="Cambria" w:hAnsi="Cambria"/>
               </w:rPr>
               <w:t xml:space="preserve">50+ dev tickets completed; 8 feature areas advanced; Student Portal in final dev sprint; accessibility standards implemented</w:t>
             </w:r>
@@ -1297,12 +1298,12 @@
             </w:pPr>
             <w:r>
               <w:rPr>
-                <w:rFonts w:ascii="Cambria" w:cs="Cambria" w:eastAsia="Cambria" w:hAnsi="Cambria"/>
                 <w:b w:val="false"/>
                 <w:bCs w:val="false"/>
                 <w:color w:val="666666"/>
                 <w:sz w:val="18"/>
                 <w:szCs w:val="18"/>
+                <w:rFonts w:ascii="Cambria" w:cs="Cambria" w:eastAsia="Cambria" w:hAnsi="Cambria"/>
               </w:rPr>
               <w:t xml:space="preserve">2026-04-08</w:t>
             </w:r>
@@ -1331,12 +1332,12 @@
             </w:pPr>
             <w:r>
               <w:rPr>
-                <w:rFonts w:ascii="Cambria" w:cs="Cambria" w:eastAsia="Cambria" w:hAnsi="Cambria"/>
                 <w:b/>
                 <w:bCs/>
                 <w:color w:val="C9A84C"/>
                 <w:sz w:val="17"/>
                 <w:szCs w:val="17"/>
+                <w:rFonts w:ascii="Cambria" w:cs="Cambria" w:eastAsia="Cambria" w:hAnsi="Cambria"/>
               </w:rPr>
               <w:t xml:space="preserve">Workplan</w:t>
             </w:r>
@@ -1365,12 +1366,12 @@
             </w:pPr>
             <w:r>
               <w:rPr>
-                <w:rFonts w:ascii="Cambria" w:cs="Cambria" w:eastAsia="Cambria" w:hAnsi="Cambria"/>
                 <w:b w:val="false"/>
                 <w:bCs w:val="false"/>
                 <w:color w:val="333333"/>
                 <w:sz w:val="18"/>
                 <w:szCs w:val="18"/>
+                <w:rFonts w:ascii="Cambria" w:cs="Cambria" w:eastAsia="Cambria" w:hAnsi="Cambria"/>
               </w:rPr>
               <w:t xml:space="preserve">Progress made across eight feature areas with 50+ development tickets completed. Key enhancements include Student Portal, AI-assisted JST parsing, credential matching, and dashboard improvements.</w:t>
             </w:r>
@@ -1401,12 +1402,12 @@
             </w:pPr>
             <w:r>
               <w:rPr>
-                <w:rFonts w:ascii="Cambria" w:cs="Cambria" w:eastAsia="Cambria" w:hAnsi="Cambria"/>
                 <w:b w:val="false"/>
                 <w:bCs w:val="false"/>
                 <w:color w:val="666666"/>
                 <w:sz w:val="18"/>
                 <w:szCs w:val="18"/>
+                <w:rFonts w:ascii="Cambria" w:cs="Cambria" w:eastAsia="Cambria" w:hAnsi="Cambria"/>
               </w:rPr>
               <w:t xml:space="preserve">2026-04-07</w:t>
             </w:r>
@@ -1435,12 +1436,12 @@
             </w:pPr>
             <w:r>
               <w:rPr>
-                <w:rFonts w:ascii="Cambria" w:cs="Cambria" w:eastAsia="Cambria" w:hAnsi="Cambria"/>
                 <w:b/>
                 <w:bCs/>
                 <w:color w:val="163A5F"/>
                 <w:sz w:val="17"/>
                 <w:szCs w:val="17"/>
+                <w:rFonts w:ascii="Cambria" w:cs="Cambria" w:eastAsia="Cambria" w:hAnsi="Cambria"/>
               </w:rPr>
               <w:t xml:space="preserve">Progress Update</w:t>
             </w:r>
@@ -1469,12 +1470,12 @@
             </w:pPr>
             <w:r>
               <w:rPr>
-                <w:rFonts w:ascii="Cambria" w:cs="Cambria" w:eastAsia="Cambria" w:hAnsi="Cambria"/>
                 <w:b w:val="false"/>
                 <w:bCs w:val="false"/>
                 <w:color w:val="333333"/>
                 <w:sz w:val="18"/>
                 <w:szCs w:val="18"/>
+                <w:rFonts w:ascii="Cambria" w:cs="Cambria" w:eastAsia="Cambria" w:hAnsi="Cambria"/>
               </w:rPr>
               <w:t xml:space="preserve">50+ dev tickets completed; 8 feature areas advanced; Student Portal in final dev sprint</w:t>
             </w:r>
@@ -1505,12 +1506,12 @@
             </w:pPr>
             <w:r>
               <w:rPr>
-                <w:rFonts w:ascii="Cambria" w:cs="Cambria" w:eastAsia="Cambria" w:hAnsi="Cambria"/>
                 <w:b w:val="false"/>
                 <w:bCs w:val="false"/>
                 <w:color w:val="666666"/>
                 <w:sz w:val="18"/>
                 <w:szCs w:val="18"/>
+                <w:rFonts w:ascii="Cambria" w:cs="Cambria" w:eastAsia="Cambria" w:hAnsi="Cambria"/>
               </w:rPr>
               <w:t xml:space="preserve">2026-04-07</w:t>
             </w:r>
@@ -1539,12 +1540,12 @@
             </w:pPr>
             <w:r>
               <w:rPr>
-                <w:rFonts w:ascii="Cambria" w:cs="Cambria" w:eastAsia="Cambria" w:hAnsi="Cambria"/>
                 <w:b/>
                 <w:bCs/>
                 <w:color w:val="C9A84C"/>
                 <w:sz w:val="17"/>
                 <w:szCs w:val="17"/>
+                <w:rFonts w:ascii="Cambria" w:cs="Cambria" w:eastAsia="Cambria" w:hAnsi="Cambria"/>
               </w:rPr>
               <w:t xml:space="preserve">Workplan</w:t>
             </w:r>
@@ -1573,12 +1574,12 @@
             </w:pPr>
             <w:r>
               <w:rPr>
-                <w:rFonts w:ascii="Cambria" w:cs="Cambria" w:eastAsia="Cambria" w:hAnsi="Cambria"/>
                 <w:b w:val="false"/>
                 <w:bCs w:val="false"/>
                 <w:color w:val="333333"/>
                 <w:sz w:val="18"/>
                 <w:szCs w:val="18"/>
+                <w:rFonts w:ascii="Cambria" w:cs="Cambria" w:eastAsia="Cambria" w:hAnsi="Cambria"/>
               </w:rPr>
               <w:t xml:space="preserve">Progress made across eight feature areas with 50+ development tickets completed. Key enhancements include Student Portal, AI-assisted JST parsing, credential matching, and dashboard improvements.</w:t>
             </w:r>
@@ -1609,12 +1610,12 @@
             </w:pPr>
             <w:r>
               <w:rPr>
-                <w:rFonts w:ascii="Cambria" w:cs="Cambria" w:eastAsia="Cambria" w:hAnsi="Cambria"/>
                 <w:b w:val="false"/>
                 <w:bCs w:val="false"/>
                 <w:color w:val="666666"/>
                 <w:sz w:val="18"/>
                 <w:szCs w:val="18"/>
+                <w:rFonts w:ascii="Cambria" w:cs="Cambria" w:eastAsia="Cambria" w:hAnsi="Cambria"/>
               </w:rPr>
               <w:t xml:space="preserve">2026-03-20</w:t>
             </w:r>
@@ -1643,12 +1644,12 @@
             </w:pPr>
             <w:r>
               <w:rPr>
-                <w:rFonts w:ascii="Cambria" w:cs="Cambria" w:eastAsia="Cambria" w:hAnsi="Cambria"/>
                 <w:b/>
                 <w:bCs/>
                 <w:color w:val="163A5F"/>
                 <w:sz w:val="17"/>
                 <w:szCs w:val="17"/>
+                <w:rFonts w:ascii="Cambria" w:cs="Cambria" w:eastAsia="Cambria" w:hAnsi="Cambria"/>
               </w:rPr>
               <w:t xml:space="preserve">Progress Update</w:t>
             </w:r>
@@ -1677,12 +1678,12 @@
             </w:pPr>
             <w:r>
               <w:rPr>
-                <w:rFonts w:ascii="Cambria" w:cs="Cambria" w:eastAsia="Cambria" w:hAnsi="Cambria"/>
                 <w:b w:val="false"/>
                 <w:bCs w:val="false"/>
                 <w:color w:val="333333"/>
                 <w:sz w:val="18"/>
                 <w:szCs w:val="18"/>
+                <w:rFonts w:ascii="Cambria" w:cs="Cambria" w:eastAsia="Cambria" w:hAnsi="Cambria"/>
               </w:rPr>
               <w:t xml:space="preserve">50+ dev tickets completed; 8 feature areas advanced; Student Portal in final dev sprint</w:t>
             </w:r>
@@ -1691,8 +1692,8 @@
       </w:tr>
     </w:tbl>
     <w:sectPr>
-      <w:headerReference w:type="default" r:id="rId7"/>
-      <w:footerReference w:type="default" r:id="rId8"/>
+      <w:headerReference w:type="default" r:id="rId6"/>
+      <w:footerReference w:type="default" r:id="rId7"/>
       <w:pgSz w:w="12240" w:h="15840" w:orient="portrait"/>
       <w:pgMar w:top="720" w:right="720" w:bottom="720" w:left="720" w:header="708" w:footer="708" w:gutter="0"/>
       <w:pgNumType/>
@@ -1704,43 +1705,6 @@
 
 <file path=word/comments.xml><?xml version="1.0" encoding="utf-8"?>
 <w:comments xmlns:cx="http://schemas.microsoft.com/office/drawing/2014/chartex" xmlns:cx1="http://schemas.microsoft.com/office/drawing/2015/9/8/chartex" xmlns:cx2="http://schemas.microsoft.com/office/drawing/2015/10/21/chartex" xmlns:cx3="http://schemas.microsoft.com/office/drawing/2016/5/9/chartex" xmlns:cx4="http://schemas.microsoft.com/office/drawing/2016/5/10/chartex" xmlns:cx5="http://schemas.microsoft.com/office/drawing/2016/5/11/chartex" xmlns:cx6="http://schemas.microsoft.com/office/drawing/2016/5/12/chartex" xmlns:cx7="http://schemas.microsoft.com/office/drawing/2016/5/13/chartex" xmlns:cx8="http://schemas.microsoft.com/office/drawing/2016/5/14/chartex" xmlns:mc="http://schemas.openxmlformats.org/markup-compatibility/2006" xmlns:aink="http://schemas.microsoft.com/office/drawing/2016/ink" xmlns:am3d="http://schemas.microsoft.com/office/drawing/2017/model3d" xmlns:o="urn:schemas-microsoft-com:office:office" xmlns:r="http://schemas.openxmlformats.org/officeDocument/2006/relationships" xmlns:m="http://schemas.openxmlformats.org/officeDocument/2006/math" xmlns:v="urn:schemas-microsoft-com:vml" xmlns:wp14="http://schemas.microsoft.com/office/word/2010/wordprocessingDrawing" xmlns:wp="http://schemas.openxmlformats.org/drawingml/2006/wordprocessingDrawing" xmlns:w10="urn:schemas-microsoft-com:office:word" xmlns:w="http://schemas.openxmlformats.org/wordprocessingml/2006/main" xmlns:w14="http://schemas.microsoft.com/office/word/2010/wordml" xmlns:w15="http://schemas.microsoft.com/office/word/2012/wordml" xmlns:w16cex="http://schemas.microsoft.com/office/word/2018/wordml/cex" xmlns:w16cid="http://schemas.microsoft.com/office/word/2016/wordml/cid" xmlns:w16="http://schemas.microsoft.com/office/word/2018/wordml" xmlns:w16sdtdh="http://schemas.microsoft.com/office/word/2020/wordml/sdtdatahash" xmlns:w16se="http://schemas.microsoft.com/office/word/2015/wordml/symex" xmlns:wpg="http://schemas.microsoft.com/office/word/2010/wordprocessingGroup" xmlns:wpi="http://schemas.microsoft.com/office/word/2010/wordprocessingInk" xmlns:wne="http://schemas.microsoft.com/office/word/2006/wordml" xmlns:wps="http://schemas.microsoft.com/office/word/2010/wordprocessingShape"/>
-</file>
-
-<file path=word/endnotes.xml><?xml version="1.0" encoding="utf-8"?>
-<w:endnotes xmlns:wpc="http://schemas.microsoft.com/office/word/2010/wordprocessingCanvas" xmlns:mc="http://schemas.openxmlformats.org/markup-compatibility/2006" xmlns:o="urn:schemas-microsoft-com:office:office" xmlns:r="http://schemas.openxmlformats.org/officeDocument/2006/relationships" xmlns:m="http://schemas.openxmlformats.org/officeDocument/2006/math" xmlns:v="urn:schemas-microsoft-com:vml" xmlns:wp14="http://schemas.microsoft.com/office/word/2010/wordprocessingDrawing" xmlns:wp="http://schemas.openxmlformats.org/drawingml/2006/wordprocessingDrawing" xmlns:w10="urn:schemas-microsoft-com:office:word" xmlns:w="http://schemas.openxmlformats.org/wordprocessingml/2006/main" xmlns:w14="http://schemas.microsoft.com/office/word/2010/wordml" xmlns:w15="http://schemas.microsoft.com/office/word/2012/wordml" xmlns:wpg="http://schemas.microsoft.com/office/word/2010/wordprocessingGroup" xmlns:wpi="http://schemas.microsoft.com/office/word/2010/wordprocessingInk" xmlns:wne="http://schemas.microsoft.com/office/word/2006/wordml" xmlns:wps="http://schemas.microsoft.com/office/word/2010/wordprocessingShape" mc:Ignorable="w14 w15 wp14">
-  <w:endnote w:type="separator" w:id="-1">
-    <w:p>
-      <w:pPr>
-        <w:spacing w:after="0" w:line="240" w:lineRule="auto"/>
-      </w:pPr>
-      <w:r>
-        <w:rPr>
-          <w:rStyle w:val="EndnoteReference"/>
-        </w:rPr>
-        <w:endnoteRef/>
-      </w:r>
-      <w:r>
-        <w:separator/>
-      </w:r>
-    </w:p>
-  </w:endnote>
-  <w:endnote w:type="continuationSeparator" w:id="0">
-    <w:p>
-      <w:pPr>
-        <w:spacing w:after="0" w:line="240" w:lineRule="auto"/>
-      </w:pPr>
-      <w:r>
-        <w:rPr>
-          <w:rStyle w:val="EndnoteReference"/>
-        </w:rPr>
-        <w:endnoteRef/>
-      </w:r>
-      <w:r>
-        <w:continuationSeparator/>
-      </w:r>
-    </w:p>
-  </w:endnote>
-</w:endnotes>
 </file>
 
 <file path=word/footer1.xml><?xml version="1.0" encoding="utf-8"?>
@@ -1756,12 +1720,12 @@
     </w:pPr>
     <w:r>
       <w:rPr>
-        <w:rFonts w:ascii="Cambria" w:cs="Cambria" w:eastAsia="Cambria" w:hAnsi="Cambria"/>
         <w:color w:val="666666"/>
         <w:sz w:val="14"/>
         <w:szCs w:val="14"/>
+        <w:rFonts w:ascii="Cambria" w:cs="Cambria" w:eastAsia="Cambria" w:hAnsi="Cambria"/>
       </w:rPr>
-      <w:t xml:space="preserve">Generated April 14, 2026  |  California Community Colleges  |  MAP Initiative</w:t>
+      <w:t xml:space="preserve">Generated July 2, 2026  |  California Community Colleges  |  MAP Initiative</w:t>
     </w:r>
     <w:r>
       <w:rPr>
@@ -1771,19 +1735,19 @@
     </w:r>
     <w:r>
       <w:rPr>
-        <w:rFonts w:ascii="Cambria" w:cs="Cambria" w:eastAsia="Cambria" w:hAnsi="Cambria"/>
         <w:color w:val="666666"/>
         <w:sz w:val="14"/>
         <w:szCs w:val="14"/>
+        <w:rFonts w:ascii="Cambria" w:cs="Cambria" w:eastAsia="Cambria" w:hAnsi="Cambria"/>
       </w:rPr>
       <w:t xml:space="preserve">Page </w:t>
     </w:r>
     <w:r>
       <w:rPr>
-        <w:rFonts w:ascii="Cambria" w:cs="Cambria" w:eastAsia="Cambria" w:hAnsi="Cambria"/>
         <w:color w:val="666666"/>
         <w:sz w:val="14"/>
         <w:szCs w:val="14"/>
+        <w:rFonts w:ascii="Cambria" w:cs="Cambria" w:eastAsia="Cambria" w:hAnsi="Cambria"/>
       </w:rPr>
       <w:fldChar w:fldCharType="begin"/>
       <w:instrText xml:space="preserve">PAGE</w:instrText>
@@ -1844,21 +1808,21 @@
     </w:pPr>
     <w:r>
       <w:rPr>
-        <w:rFonts w:ascii="Cambria" w:cs="Cambria" w:eastAsia="Cambria" w:hAnsi="Cambria"/>
         <w:b/>
         <w:bCs/>
         <w:color w:val="0A2240"/>
         <w:sz w:val="16"/>
         <w:szCs w:val="16"/>
+        <w:rFonts w:ascii="Cambria" w:cs="Cambria" w:eastAsia="Cambria" w:hAnsi="Cambria"/>
       </w:rPr>
       <w:t xml:space="preserve">Credit for Prior Learning Workplan  </w:t>
     </w:r>
     <w:r>
       <w:rPr>
-        <w:rFonts w:ascii="Cambria" w:cs="Cambria" w:eastAsia="Cambria" w:hAnsi="Cambria"/>
         <w:color w:val="666666"/>
         <w:sz w:val="16"/>
         <w:szCs w:val="16"/>
+        <w:rFonts w:ascii="Cambria" w:cs="Cambria" w:eastAsia="Cambria" w:hAnsi="Cambria"/>
       </w:rPr>
       <w:t xml:space="preserve">|  MAP Platform Development</w:t>
     </w:r>
@@ -1990,9 +1954,9 @@
   <w:docDefaults>
     <w:rPrDefault>
       <w:rPr>
-        <w:rFonts w:ascii="Cambria" w:cs="Cambria" w:eastAsia="Cambria" w:hAnsi="Cambria"/>
         <w:sz w:val="22"/>
         <w:szCs w:val="22"/>
+        <w:rFonts w:ascii="Cambria" w:cs="Cambria" w:eastAsia="Cambria" w:hAnsi="Cambria"/>
       </w:rPr>
     </w:rPrDefault>
     <w:pPrDefault/>
@@ -2090,8 +2054,8 @@
     <w:uiPriority w:val="99"/>
     <w:unhideWhenUsed/>
     <w:rPr>
+      <w:u w:val="single"/>
       <w:color w:val="0563C1"/>
-      <w:u w:val="single"/>
     </w:rPr>
   </w:style>
   <w:style w:type="character" w:styleId="FootnoteReference">
@@ -2131,59 +2095,22 @@
       <w:szCs w:val="20"/>
     </w:rPr>
   </w:style>
-  <w:style w:type="character" w:styleId="EndnoteReference">
-    <w:name w:val="endnote reference"/>
-    <w:basedOn w:val="DefaultParagraphFont"/>
-    <w:uiPriority w:val="99"/>
-    <w:semiHidden/>
-    <w:unhideWhenUsed/>
-    <w:rPr>
-      <w:vertAlign w:val="superscript"/>
-    </w:rPr>
-  </w:style>
-  <w:style w:type="paragraph" w:styleId="EndnoteText">
-    <w:name w:val="endnote text"/>
-    <w:basedOn w:val="Normal"/>
-    <w:link w:val="EndnoteTextChar"/>
-    <w:uiPriority w:val="99"/>
-    <w:semiHidden/>
-    <w:unhideWhenUsed/>
-    <w:pPr>
-      <w:spacing w:after="0" w:line="240" w:lineRule="auto"/>
-    </w:pPr>
-    <w:rPr>
-      <w:sz w:val="20"/>
-      <w:szCs w:val="20"/>
-    </w:rPr>
-  </w:style>
-  <w:style w:type="character" w:styleId="EndnoteTextChar">
-    <w:name w:val="Endnote Text Char"/>
-    <w:basedOn w:val="DefaultParagraphFont"/>
-    <w:link w:val="EndnoteText"/>
-    <w:uiPriority w:val="99"/>
-    <w:semiHidden/>
-    <w:unhideWhenUsed/>
-    <w:rPr>
-      <w:sz w:val="20"/>
-      <w:szCs w:val="20"/>
-    </w:rPr>
-  </w:style>
   <w:style w:type="paragraph" w:styleId="Heading1">
     <w:name w:val="Heading 1"/>
     <w:basedOn w:val="Normal"/>
     <w:next w:val="Normal"/>
     <w:qFormat/>
     <w:pPr>
-      <w:spacing w:after="160" w:before="300"/>
+      <w:spacing w:before="300" w:after="160"/>
       <w:outlineLvl w:val="0"/>
     </w:pPr>
     <w:rPr>
-      <w:rFonts w:ascii="Cambria" w:cs="Cambria" w:eastAsia="Cambria" w:hAnsi="Cambria"/>
       <w:b/>
       <w:bCs/>
       <w:color w:val="0A2240"/>
       <w:sz w:val="32"/>
       <w:szCs w:val="32"/>
+      <w:rFonts w:ascii="Cambria" w:cs="Cambria" w:eastAsia="Cambria" w:hAnsi="Cambria"/>
     </w:rPr>
   </w:style>
   <w:style w:type="paragraph" w:styleId="Heading2">
@@ -2192,16 +2119,16 @@
     <w:next w:val="Normal"/>
     <w:qFormat/>
     <w:pPr>
-      <w:spacing w:after="120" w:before="240"/>
+      <w:spacing w:before="240" w:after="120"/>
       <w:outlineLvl w:val="1"/>
     </w:pPr>
     <w:rPr>
-      <w:rFonts w:ascii="Cambria" w:cs="Cambria" w:eastAsia="Cambria" w:hAnsi="Cambria"/>
       <w:b/>
       <w:bCs/>
       <w:color w:val="163A5F"/>
       <w:sz w:val="26"/>
       <w:szCs w:val="26"/>
+      <w:rFonts w:ascii="Cambria" w:cs="Cambria" w:eastAsia="Cambria" w:hAnsi="Cambria"/>
     </w:rPr>
   </w:style>
   <w:style w:type="paragraph" w:styleId="Heading3">
@@ -2210,16 +2137,16 @@
     <w:next w:val="Normal"/>
     <w:qFormat/>
     <w:pPr>
-      <w:spacing w:after="100" w:before="180"/>
+      <w:spacing w:before="180" w:after="100"/>
       <w:outlineLvl w:val="2"/>
     </w:pPr>
     <w:rPr>
-      <w:rFonts w:ascii="Cambria" w:cs="Cambria" w:eastAsia="Cambria" w:hAnsi="Cambria"/>
       <w:b/>
       <w:bCs/>
       <w:color w:val="163A5F"/>
       <w:sz w:val="23"/>
       <w:szCs w:val="23"/>
+      <w:rFonts w:ascii="Cambria" w:cs="Cambria" w:eastAsia="Cambria" w:hAnsi="Cambria"/>
     </w:rPr>
   </w:style>
 </w:styles>

</xml_diff>